<commit_message>
Sync ownership to Shaked Akrish + add browser calculator and deployment configs
- Replace owner name across docs, presentation, git config, and settings
- Fix model accuracy: LR/Ridge as Best Model in all reports (sync with model_meta.json)
- Add standalone browser calculator (calculator.html) — no server required
- Configure Streamlit Community Cloud deployment (runtime.txt, .streamlit/config.toml, requirements pin)
- Add DEPLOY.md with step-by-step deployment instructions
- Improve presentation Hebrew clarity (slides 2-8)
- Sync build_pptx.js with presentation edits
- Clean up gradient_boosting_reg bug in train.py
- Update README/SKILL with Live Demo section and Python 3.12 compatibility
</commit_message>
<xml_diff>
--- a/docs/final_report.docx
+++ b/docs/final_report.docx
@@ -2324,7 +2324,7 @@
                 <w:sz w:val="20"/>
                 <w:szCs w:val="20"/>
               </w:rPr>
-              <w:t>מיטבי</w:t>
+              <w:t xml:space="preserve">מקום שני </w:t>
             </w:r>
             <w:proofErr w:type="spellEnd"/>
             <w:r>
@@ -2333,16 +2333,15 @@
                 <w:sz w:val="20"/>
                 <w:szCs w:val="20"/>
               </w:rPr>
-              <w:t xml:space="preserve"> (CV-AUC=0.9837) — </w:t>
+              <w:t xml:space="preserve"> (CV-AUC=0.9837)</w:t>
             </w:r>
-            <w:proofErr w:type="spellStart"/>
             <w:r>
               <w:rPr>
                 <w:color w:val="000000"/>
                 <w:sz w:val="20"/>
                 <w:szCs w:val="20"/>
               </w:rPr>
-              <w:t>נבחר</w:t>
+              <w:t xml:space="preserve"/>
             </w:r>
             <w:proofErr w:type="spellEnd"/>
           </w:p>
@@ -2767,7 +2766,7 @@
                 <w:sz w:val="20"/>
                 <w:szCs w:val="20"/>
               </w:rPr>
-              <w:t xml:space="preserve">Baseline — </w:t>
+              <w:t xml:space="preserve">מיטבי — נבחר ★ (CV-AUC=0.9889)</w:t>
             </w:r>
             <w:proofErr w:type="spellStart"/>
             <w:r>
@@ -2776,7 +2775,7 @@
                 <w:sz w:val="20"/>
                 <w:szCs w:val="20"/>
               </w:rPr>
-              <w:t>לינארי</w:t>
+              <w:t xml:space="preserve"/>
             </w:r>
             <w:proofErr w:type="spellEnd"/>
             <w:r>
@@ -2785,7 +2784,7 @@
                 <w:sz w:val="20"/>
                 <w:szCs w:val="20"/>
               </w:rPr>
-              <w:t xml:space="preserve">, </w:t>
+              <w:t xml:space="preserve"/>
             </w:r>
             <w:proofErr w:type="spellStart"/>
             <w:r>
@@ -2794,7 +2793,7 @@
                 <w:sz w:val="20"/>
                 <w:szCs w:val="20"/>
               </w:rPr>
-              <w:t>לא</w:t>
+              <w:t/>
             </w:r>
             <w:proofErr w:type="spellEnd"/>
             <w:r>
@@ -2803,7 +2802,7 @@
                 <w:sz w:val="20"/>
                 <w:szCs w:val="20"/>
               </w:rPr>
-              <w:t xml:space="preserve"> </w:t>
+              <w:t xml:space="preserve"/>
             </w:r>
             <w:proofErr w:type="spellStart"/>
             <w:r>
@@ -2812,7 +2811,7 @@
                 <w:sz w:val="20"/>
                 <w:szCs w:val="20"/>
               </w:rPr>
-              <w:t>מספיק</w:t>
+              <w:t xml:space="preserve"/>
             </w:r>
             <w:proofErr w:type="spellEnd"/>
           </w:p>

</xml_diff>